<commit_message>
sync final English manuscript and evidence files
</commit_message>
<xml_diff>
--- a/系统评价_最终英文投稿交付版/Submission_Requirements_and_Only_Remaining_Items.docx
+++ b/系统评价_最终英文投稿交付版/Submission_Requirements_and_Only_Remaining_Items.docx
@@ -29,7 +29,7 @@
         <w:pStyle w:val="ListBullet"/>
       </w:pPr>
       <w:r>
-        <w:t>Screening: 752 saved outcomes are present (530 exclude; 222 seek full text); 3 rows remain without a researcher decision. The saved confirmation date is global (25 October 2026), and the reviewer is not named.</w:t>
+        <w:t>Screening: all 755 rows now have a current or recovered decision: 533 exclusions and 222 reports sought for full text. MAIN-0271, MAIN-0282, and MAIN-0290 were excluded by explicit author confirmation on 27 October 2026; these are current-turn decisions, not backdated historical decisions.</w:t>
       </w:r>
     </w:p>
     <w:p>
@@ -45,7 +45,7 @@
         <w:pStyle w:val="ListBullet"/>
       </w:pPr>
       <w:r>
-        <w:t>PRISMA: not closed. Of 222 reports sought, only 33 have exact DOI linkage to the current 38-report candidate inventory; 189 have no recovered outcome link. W34–W36 are full-text candidates despite saved title/abstract exclusion labels. The 35-study/37-report synthesis set remains the current author-designated set, not a fully traceable screening flow.</w:t>
+        <w:t>PRISMA: not closed. Of 222 reports sought, 33 have exact DOI linkage to the current 38-report candidate inventory; 189 have no recovered retrieval/eligibility outcome mapping. W34–W36 are full-text candidates despite saved title/abstract exclusion labels. The 35-study/37-report synthesis set remains the current author-designated set, not a fully traceable screening flow.</w:t>
       </w:r>
     </w:p>
     <w:p>
@@ -61,7 +61,7 @@
         <w:pStyle w:val="Heading2"/>
       </w:pPr>
       <w:r>
-        <w:t>1. Decide the 3 unresolved title/abstract records</w:t>
+        <w:t>1. Confirm the three current-turn exclusions were entered correctly. The records are MAIN-0271, MAIN-0282, and MAIN-0290; the workbook records the real confirmation date 2026-10-27 and keeps the historical status separate.</w:t>
       </w:r>
     </w:p>
     <w:p>
@@ -74,7 +74,7 @@
         <w:pStyle w:val="Heading2"/>
       </w:pPr>
       <w:r>
-        <w:t>2. Resolve report outcomes for 189 requested reports</w:t>
+        <w:t>2. Resolve report outcomes for 189 requested reports. Provide or identify the existing full-text retrieval/eligibility log for rows marked PENDING_OUTCOME_LINKAGE in PRISMA_2020_Final.xlsx → “222 full-text request mapping”. The minimum evidence is retrieval status, report identity if obtained, eligibility outcome, and exclusion reason if excluded.</w:t>
       </w:r>
     </w:p>
     <w:p>
@@ -145,6 +145,62 @@
     <w:p>
       <w:r>
         <w:t>Not yet ready for a fully auditable PRISMA submission: 189 report outcomes remain unlinked, three title/abstract decisions are open, and W34–W36 have an undocumented cross-stage discrepancy. The saved appraisal judgments are present and their reviewer identity is explicitly recorded as unavailable. Official current journal formatting requirements and author declarations also remain to be completed.</w:t>
+      </w:r>
+    </w:p>
+    <w:p>
+      <w:pPr>
+        <w:pStyle w:val="Heading1"/>
+      </w:pPr>
+      <w:r>
+        <w:t>Evidence synchronization update — 28 October 2026</w:t>
+      </w:r>
+    </w:p>
+    <w:p>
+      <w:pPr>
+        <w:pStyle w:val="ListBullet"/>
+      </w:pPr>
+      <w:r>
+        <w:t>The completed synthesis remains 35 studies in 37 reports (Class A=25, B=7, C=3).</w:t>
+      </w:r>
+    </w:p>
+    <w:p>
+      <w:pPr>
+        <w:pStyle w:val="ListBullet"/>
+      </w:pPr>
+      <w:r>
+        <w:t>Provide the record-level workbook identifying the 168 abstract-level recommendations, 14 completed full-text initial assessments, and 7 unobtained reports.</w:t>
+      </w:r>
+    </w:p>
+    <w:p>
+      <w:pPr>
+        <w:pStyle w:val="ListBullet"/>
+      </w:pPr>
+      <w:r>
+        <w:t>For the eight inclusion candidates, complete Study_ID/Report_ID linkage, data extraction, design classification, and design-appropriate quality appraisal before adding them to the synthesis.</w:t>
+      </w:r>
+    </w:p>
+    <w:p>
+      <w:pPr>
+        <w:pStyle w:val="ListBullet"/>
+      </w:pPr>
+      <w:r>
+        <w:t>Resolve the two undecided full-text assessments. MAIN-0076 currently has only a provisional author preference toward exclusion.</w:t>
+      </w:r>
+    </w:p>
+    <w:p>
+      <w:pPr>
+        <w:pStyle w:val="ListBullet"/>
+      </w:pPr>
+      <w:r>
+        <w:t>Document the correction or reinstatement pathway for W34–W36.</w:t>
+      </w:r>
+    </w:p>
+    <w:p>
+      <w:pPr>
+        <w:pStyle w:val="ListBullet"/>
+      </w:pPr>
+      <w:r>
+        <w:t>Until these steps are completed, retain the PRISMA figure as a working, not closed, pathway.</w:t>
       </w:r>
     </w:p>
     <w:sectPr>

</xml_diff>